<commit_message>
Updated class diagram in proposal
</commit_message>
<xml_diff>
--- a/JM 24308453 Data Structures and Algorithms CA1 Proposal.docx
+++ b/JM 24308453 Data Structures and Algorithms CA1 Proposal.docx
@@ -113,23 +113,7 @@
           <w:sz w:val="24"/>
           <w:szCs w:val="24"/>
         </w:rPr>
-        <w:t xml:space="preserve">I have decided to make an app that will queue up Urban Greening and Biodiversity projects and allow users to vote on which projects should take priority. It will also have a tree structure that will sort the projects by their location. The app will also allow users to submit their own projects for review, which will be displayed in a stack for an admin to review before accepting or rejecting it. Should the project be approved, the admin will input a predicted budget and timeframe for the </w:t>
-      </w:r>
-      <w:proofErr w:type="gramStart"/>
-      <w:r>
-        <w:rPr>
-          <w:sz w:val="24"/>
-          <w:szCs w:val="24"/>
-        </w:rPr>
-        <w:t>project</w:t>
-      </w:r>
-      <w:proofErr w:type="gramEnd"/>
-      <w:r>
-        <w:rPr>
-          <w:sz w:val="24"/>
-          <w:szCs w:val="24"/>
-        </w:rPr>
-        <w:t xml:space="preserve"> and it will be added to the queue and tree. If the project is rejected it will be deleted.</w:t>
+        <w:t>I have decided to make an app that will queue up Urban Greening and Biodiversity projects and allow users to vote on which projects should take priority. It will also have a tree structure that will sort the projects by their location. The app will also allow users to submit their own projects for review, which will be displayed in a stack for an admin to review before accepting or rejecting it. Should the project be approved, the admin will input a predicted budget and timeframe for the project and it will be added to the queue and tree. If the project is rejected it will be deleted.</w:t>
       </w:r>
     </w:p>
     <w:p>
@@ -242,15 +226,7 @@
             <w:sz w:val="24"/>
             <w:szCs w:val="24"/>
           </w:rPr>
-          <w:t>https://www.</w:t>
-        </w:r>
-        <w:r>
-          <w:rPr>
-            <w:rStyle w:val="Hyperlink"/>
-            <w:sz w:val="24"/>
-            <w:szCs w:val="24"/>
-          </w:rPr>
-          <w:t>github.com/Aven-Lee-Fox/JM-24308453-Data-Structures-and-Algorithms-CA1</w:t>
+          <w:t>https://www.github.com/Aven-Lee-Fox/JM-24308453-Data-Structures-and-Algorithms-CA1</w:t>
         </w:r>
       </w:hyperlink>
       <w:r>
@@ -331,10 +307,10 @@
           <w:szCs w:val="24"/>
         </w:rPr>
         <w:drawing>
-          <wp:inline distT="0" distB="0" distL="0" distR="0" wp14:anchorId="4A222E9B" wp14:editId="44B0137B">
-            <wp:extent cx="5722620" cy="2065020"/>
-            <wp:effectExtent l="0" t="0" r="0" b="0"/>
-            <wp:docPr id="700408544" name="Picture 1"/>
+          <wp:inline distT="0" distB="0" distL="0" distR="0" wp14:anchorId="3039A111" wp14:editId="0B73B368">
+            <wp:extent cx="5730240" cy="3032760"/>
+            <wp:effectExtent l="0" t="0" r="3810" b="0"/>
+            <wp:docPr id="1530620071" name="Picture 1"/>
             <wp:cNvGraphicFramePr>
               <a:graphicFrameLocks xmlns:a="http://schemas.openxmlformats.org/drawingml/2006/main" noChangeAspect="1"/>
             </wp:cNvGraphicFramePr>
@@ -363,7 +339,7 @@
                   <pic:spPr bwMode="auto">
                     <a:xfrm>
                       <a:off x="0" y="0"/>
-                      <a:ext cx="5722620" cy="2065020"/>
+                      <a:ext cx="5730240" cy="3032760"/>
                     </a:xfrm>
                     <a:prstGeom prst="rect">
                       <a:avLst/>

</xml_diff>